<commit_message>
Bổ sung dòng 'góp ý thầy' vào Slide 4: luồng Bàn → Gọi món phải gọi sẵn bàn
Thêm 1 dòng mới vào bảng so sánh giữa kỳ - cuối kỳ (từ 7 → 8 dòng):
- Tiêu chí: 'Luồng Bàn → Gọi món (góp ý thầy)'
- Giữa kỳ: nút 'Gọi thêm món' chỉ link order.html → phải chọn lại bàn
- Cuối kì: link order.html?banId={id} → order.js đọc URLSearchParams, tự gọi chonBan()

Cập nhật lời dẫn Slide 4 từ 6 điểm thành 8 điểm, trong đó điểm thứ 8 nhấn mạnh
đây là góp ý trực tiếp từ thầy.

Xác minh code hiện tại đã đáp ứng:
- ban.js line 197: <a href="order.html?banId=${banId}"> thay vì <a href="order.html">
- order.js line 27-34: dùng URLSearchParams(window.location.search).get('banId')
  rồi set cboBan.value và gọi chonBan() tự động
</commit_message>
<xml_diff>
--- a/KeHoachSlidePowerPoint_QuanLyNhaHang_HoQuangHuy.docx
+++ b/KeHoachSlidePowerPoint_QuanLyNhaHang_HoQuangHuy.docx
@@ -1879,7 +1879,7 @@
           <w:i w:val="0"/>
           <w:sz w:val="26"/>
         </w:rPr>
-        <w:t>Bảng 2 cột "Bài giữa kỳ" | "Bài cuối kì" với 7 dòng. Đây là slide quan trọng nhất — giảng viên rất quan tâm. Mỗi dòng chỉ 5–7 từ để dễ đọc trong 40 giây.</w:t>
+        <w:t>Bảng 2 cột "Bài giữa kỳ" | "Bài cuối kì" với 8 dòng. Đây là slide quan trọng nhất — giảng viên rất quan tâm, đặc biệt dòng cuối là góp ý trực tiếp từ thầy. Mỗi dòng chỉ 5–7 từ để dễ đọc trong 40 giây.</w:t>
       </w:r>
     </w:p>
     <w:tbl>
@@ -2411,6 +2411,70 @@
           </w:p>
         </w:tc>
       </w:tr>
+      <w:tr>
+        <w:tc>
+          <w:tcPr>
+            <w:tcW w:type="dxa" w:w="2551"/>
+            <w:vAlign w:val="center"/>
+          </w:tcPr>
+          <w:p>
+            <w:pPr>
+              <w:jc w:val="left"/>
+            </w:pPr>
+            <w:r>
+              <w:rPr>
+                <w:rFonts w:ascii="Times New Roman" w:hAnsi="Times New Roman" w:eastAsia="Times New Roman"/>
+                <w:b/>
+                <w:i w:val="0"/>
+                <w:sz w:val="20"/>
+              </w:rPr>
+              <w:t>Luồng Bàn → Gọi món (góp ý thầy)</w:t>
+            </w:r>
+          </w:p>
+        </w:tc>
+        <w:tc>
+          <w:tcPr>
+            <w:tcW w:type="dxa" w:w="3118"/>
+            <w:vAlign w:val="center"/>
+            <w:shd w:val="clear" w:fill="FCE4E4"/>
+          </w:tcPr>
+          <w:p>
+            <w:pPr>
+              <w:jc w:val="left"/>
+            </w:pPr>
+            <w:r>
+              <w:rPr>
+                <w:rFonts w:ascii="Times New Roman" w:hAnsi="Times New Roman" w:eastAsia="Times New Roman"/>
+                <w:b w:val="0"/>
+                <w:i w:val="0"/>
+                <w:sz w:val="20"/>
+              </w:rPr>
+              <w:t>Nút "Gọi thêm món" chỉ link order.html — vào trang order phải chọn lại bàn</w:t>
+            </w:r>
+          </w:p>
+        </w:tc>
+        <w:tc>
+          <w:tcPr>
+            <w:tcW w:type="dxa" w:w="3118"/>
+            <w:vAlign w:val="center"/>
+            <w:shd w:val="clear" w:fill="E4F4E4"/>
+          </w:tcPr>
+          <w:p>
+            <w:pPr>
+              <w:jc w:val="left"/>
+            </w:pPr>
+            <w:r>
+              <w:rPr>
+                <w:rFonts w:ascii="Times New Roman" w:hAnsi="Times New Roman" w:eastAsia="Times New Roman"/>
+                <w:b w:val="0"/>
+                <w:i w:val="0"/>
+                <w:sz w:val="20"/>
+              </w:rPr>
+              <w:t>Link order.html?banId={id} → order.js đọc URLSearchParams, tự gọi chonBan() — bàn được gọi sẵn, không cần chọn lại</w:t>
+            </w:r>
+          </w:p>
+        </w:tc>
+      </w:tr>
     </w:tbl>
     <w:p>
       <w:pPr>
@@ -2467,7 +2531,7 @@
           <w:color w:val="333333"/>
           <w:sz w:val="26"/>
         </w:rPr>
-        <w:t>"So với bài giữa kỳ, em đã khắc phục 6 điểm quan trọng. Thứ nhất, chuyển từ SQLite sang Microsoft Access để phù hợp môi trường Windows và dùng được OleDb. Thứ hai, sửa lỗi "Data type mismatch" bằng cách bỏ AddWithValue, dùng Parameters.Add với OleDbType tường minh và tham số positional thay vì named. Thứ ba, thêm module đăng nhập với phân quyền QuanTri/NhanVien — bài giữa kỳ không có. Thứ tư, thêm module báo cáo doanh thu theo ngày. Thứ năm, bỏ băm SHA-256 mật khẩu vì đây là đồ án nhỏ, lưu plain-text để em tự thêm-sửa dữ liệu trong Access được luôn. Thứ sáu, tích hợp WebView2 đóng gói thành desktop app WinExe, và thêm ghi chú tiếng Việt 100% từng dòng code để phục vụ thi vấn đáp 1-1 với thầy."</w:t>
+        <w:t>"So với bài giữa kỳ, em đã khắc phục 8 điểm quan trọng. Thứ nhất, chuyển từ SQLite sang Microsoft Access để phù hợp môi trường Windows và dùng được OleDb. Thứ hai, sửa lỗi "Data type mismatch" bằng cách bỏ AddWithValue, dùng Parameters.Add với OleDbType tường minh và tham số positional thay vì named. Thứ ba, thêm module đăng nhập với phân quyền QuanTri/NhanVien — bài giữa kỳ không có. Thứ tư, thêm module báo cáo doanh thu theo ngày. Thứ năm, bỏ băm SHA-256 mật khẩu vì đây là đồ án nhỏ, lưu plain-text để em tự thêm-sửa dữ liệu trong Access được luôn. Thứ sáu, tích hợp WebView2 đóng gói thành desktop app WinExe. Thứ bảy, thêm ghi chú tiếng Việt 100% từng dòng code để phục vụ thi vấn đáp 1-1 với thầy. Thứ tám — đây là điểm thầy góp ý trực tiếp — sửa luồng từ trang Bàn sang trang Gọi món: trước đây nút "Gọi thêm món" chỉ chuyển trang order.html, người dùng phải chọn lại bàn; giờ em sửa thành link order.html?banId={id}, bên order.js đọc URLSearchParams và tự gọi hàm chonBan() để bàn được chọn sẵn, đúng như ý thầy muốn: từ bàn → gọi thêm bàn → qua giao diện gọi món phải gọi sẵn bàn."</w:t>
       </w:r>
     </w:p>
     <w:p>

</xml_diff>